<commit_message>
Extend 明鑑鏡心 V6.1 sweep to closing chapter and version history
Beyond the cover/overview bump, the document-wide V5.9 -> V6.1
upgrade now covers the closing 全本同步收束 chapter, the version
declarations, the FK-XM-001 governance field, the closing
"完整版 終" marker, and adds a V6.1 entry to both version-history
lists. Per-version historical volume titles (ch.28-31 headings,
V5.1-V5.8 volume-end markers, the ✦ progression lines) are kept
intact, per the document's own preservation rule.

https://claude.ai/code/session_01NzAt1jc4KjpP9gA228iur8
</commit_message>
<xml_diff>
--- a/明鑑鏡心_V6.1.docx
+++ b/明鑑鏡心_V6.1.docx
@@ -486,6 +486,14 @@
       <w:r>
         <w:br/>
         <w:t>✦  V5.9    —— 網名占系統卷（第三十一章：真名 vs 網名識別 + Big Five/Dark Triad/精神醫學多學科學術基底 + 間接揭示輸出格式 + FK-XM-016 鐵律「A 級不可告知」—— 沒人喜歡被分析）</w:t>
+      </w:r>
+      <w:r>
+        <w:rPr>
+          <w:b/>
+          <w:color w:val="B02A2A"/>
+        </w:rPr>
+        <w:br/>
+        <w:t xml:space="preserve">✦  V6.1    —— 跨語種智慧共享原則卷（第一章 1.5 + 第四章 4.5：跨語種智慧無條件共享給全體使用者 + 系統絕不識別／預設／分配使用者文化身分 + 陌生感即產品差異性即商業價值 + 全域死命令 D4）</w:t>
       </w:r>
     </w:p>
     <w:p>
@@ -47893,61 +47901,7 @@
         <w:rPr>
           <w:sz w:val="20"/>
         </w:rPr>
-        <w:t>FK-XM-001</w:t>
-      </w:r>
-      <w:r>
-        <w:rPr>
-          <w:sz w:val="20"/>
-        </w:rPr>
-        <w:t>：姓名學</w:t>
-      </w:r>
-      <w:r>
-        <w:rPr>
-          <w:sz w:val="20"/>
-        </w:rPr>
-        <w:t xml:space="preserve"> Primary Kernel </w:t>
-      </w:r>
-      <w:r>
-        <w:rPr>
-          <w:sz w:val="20"/>
-        </w:rPr>
-        <w:t>任何輸出，必經</w:t>
-      </w:r>
-      <w:r>
-        <w:rPr>
-          <w:sz w:val="20"/>
-        </w:rPr>
-        <w:t xml:space="preserve"> 4 </w:t>
-      </w:r>
-      <w:r>
-        <w:rPr>
-          <w:sz w:val="20"/>
-        </w:rPr>
-        <w:t>治理欄位審查（治理</w:t>
-      </w:r>
-      <w:r>
-        <w:rPr>
-          <w:sz w:val="20"/>
-        </w:rPr>
-        <w:t xml:space="preserve"> V5.9</w:t>
-      </w:r>
-      <w:r>
-        <w:rPr>
-          <w:sz w:val="20"/>
-        </w:rPr>
-        <w:t>／決策結構／靈魂時空尺度／跨</w:t>
-      </w:r>
-      <w:r>
-        <w:rPr>
-          <w:sz w:val="20"/>
-        </w:rPr>
-        <w:t xml:space="preserve"> Kernel</w:t>
-      </w:r>
-      <w:r>
-        <w:rPr>
-          <w:sz w:val="20"/>
-        </w:rPr>
-        <w:t>）。</w:t>
+        <w:t xml:space="preserve">FK-XM-001：姓名學 Primary Kernel 任何輸出，必經 4 治理欄位審查（治理 V6.1／決策結構／靈魂時空尺度／跨 Kernel）。</w:t>
       </w:r>
     </w:p>
     <w:p>
@@ -52816,40 +52770,7 @@
           <w:color w:val="B40000"/>
           <w:sz w:val="36"/>
         </w:rPr>
-        <w:lastRenderedPageBreak/>
-        <w:t>【</w:t>
-      </w:r>
-      <w:r>
-        <w:rPr>
-          <w:b/>
-          <w:color w:val="B40000"/>
-          <w:sz w:val="36"/>
-        </w:rPr>
-        <w:t xml:space="preserve">V5.9 </w:t>
-      </w:r>
-      <w:r>
-        <w:rPr>
-          <w:b/>
-          <w:color w:val="B40000"/>
-          <w:sz w:val="36"/>
-        </w:rPr>
-        <w:t>全本同步收束】（</w:t>
-      </w:r>
-      <w:r>
-        <w:rPr>
-          <w:b/>
-          <w:color w:val="B40000"/>
-          <w:sz w:val="36"/>
-        </w:rPr>
-        <w:t xml:space="preserve">2026-05-21 </w:t>
-      </w:r>
-      <w:r>
-        <w:rPr>
-          <w:b/>
-          <w:color w:val="B40000"/>
-          <w:sz w:val="36"/>
-        </w:rPr>
-        <w:t>永久鎖定）</w:t>
+        <w:t xml:space="preserve">【V6.1 全本同步收束】（2026-05-21 永久鎖定）</w:t>
       </w:r>
     </w:p>
     <w:p/>
@@ -52858,67 +52779,7 @@
         <w:rPr>
           <w:b/>
         </w:rPr>
-        <w:t>本《明鑑鏡心子引擎建構規格書》</w:t>
-      </w:r>
-      <w:r>
-        <w:rPr>
-          <w:b/>
-        </w:rPr>
-        <w:t xml:space="preserve">V5.9 </w:t>
-      </w:r>
-      <w:r>
-        <w:rPr>
-          <w:b/>
-        </w:rPr>
-        <w:t>完整版</w:t>
-      </w:r>
-      <w:r>
-        <w:rPr>
-          <w:b/>
-        </w:rPr>
-        <w:t>—</w:t>
-      </w:r>
-      <w:r>
-        <w:rPr>
-          <w:b/>
-        </w:rPr>
-        <w:t>一份檔案完整收錄</w:t>
-      </w:r>
-      <w:r>
-        <w:rPr>
-          <w:b/>
-        </w:rPr>
-        <w:t xml:space="preserve"> V1 </w:t>
-      </w:r>
-      <w:r>
-        <w:rPr>
-          <w:b/>
-        </w:rPr>
-        <w:t>至</w:t>
-      </w:r>
-      <w:r>
-        <w:rPr>
-          <w:b/>
-        </w:rPr>
-        <w:t xml:space="preserve"> V5.9 </w:t>
-      </w:r>
-      <w:r>
-        <w:rPr>
-          <w:b/>
-        </w:rPr>
-        <w:t>全部版本內容，全本上下文一律同步至</w:t>
-      </w:r>
-      <w:r>
-        <w:rPr>
-          <w:b/>
-        </w:rPr>
-        <w:t xml:space="preserve"> V5.9 </w:t>
-      </w:r>
-      <w:r>
-        <w:rPr>
-          <w:b/>
-        </w:rPr>
-        <w:t>統一版本。</w:t>
+        <w:t xml:space="preserve">本《明鑑鏡心子引擎建構規格書》V6.1 完整版—一份檔案完整收錄 V1 至 V6.1 全部版本內容，全本上下文一律同步至 V6.1 統一版本。</w:t>
       </w:r>
     </w:p>
     <w:p/>
@@ -52929,707 +52790,1130 @@
           <w:color w:val="A00050"/>
           <w:sz w:val="28"/>
         </w:rPr>
-        <w:t>版本歷程總覽（</w:t>
-      </w:r>
+        <w:t xml:space="preserve">版本歷程總覽（V1 → V6.1）</w:t>
+      </w:r>
+    </w:p>
+    <w:p/>
+    <w:p>
+      <w:r>
+        <w:rPr>
+          <w:sz w:val="21"/>
+        </w:rPr>
+        <w:t>✦</w:t>
+      </w:r>
+      <w:r>
+        <w:rPr>
+          <w:sz w:val="21"/>
+        </w:rPr>
+        <w:t xml:space="preserve">  V1</w:t>
+      </w:r>
+      <w:r>
+        <w:rPr>
+          <w:sz w:val="21"/>
+        </w:rPr>
+        <w:t xml:space="preserve">　六大模組（</w:t>
+      </w:r>
+      <w:r>
+        <w:rPr>
+          <w:sz w:val="21"/>
+        </w:rPr>
+        <w:t>M1 ~ M6</w:t>
+      </w:r>
+      <w:r>
+        <w:rPr>
+          <w:sz w:val="21"/>
+        </w:rPr>
+        <w:t>）建立基本架構</w:t>
+      </w:r>
+    </w:p>
+    <w:p>
+      <w:r>
+        <w:rPr>
+          <w:sz w:val="21"/>
+        </w:rPr>
+        <w:t>✦</w:t>
+      </w:r>
+      <w:r>
+        <w:rPr>
+          <w:sz w:val="21"/>
+        </w:rPr>
+        <w:t xml:space="preserve">  V2</w:t>
+      </w:r>
+      <w:r>
+        <w:rPr>
+          <w:sz w:val="21"/>
+        </w:rPr>
+        <w:t xml:space="preserve">　新增</w:t>
+      </w:r>
+      <w:r>
+        <w:rPr>
+          <w:sz w:val="21"/>
+        </w:rPr>
+        <w:t xml:space="preserve"> M7</w:t>
+      </w:r>
+      <w:r>
+        <w:rPr>
+          <w:sz w:val="21"/>
+        </w:rPr>
+        <w:t>（情緒安撫）</w:t>
+      </w:r>
+      <w:r>
+        <w:rPr>
+          <w:sz w:val="21"/>
+        </w:rPr>
+        <w:t>+ M8</w:t>
+      </w:r>
+      <w:r>
+        <w:rPr>
+          <w:sz w:val="21"/>
+        </w:rPr>
+        <w:t>（如實說切換）</w:t>
+      </w:r>
+      <w:r>
+        <w:rPr>
+          <w:sz w:val="21"/>
+        </w:rPr>
+        <w:t xml:space="preserve">+ </w:t>
+      </w:r>
+      <w:r>
+        <w:rPr>
+          <w:sz w:val="21"/>
+        </w:rPr>
+        <w:t>全域死命令</w:t>
+      </w:r>
+      <w:r>
+        <w:rPr>
+          <w:sz w:val="21"/>
+        </w:rPr>
+        <w:t xml:space="preserve"> D2</w:t>
+      </w:r>
+    </w:p>
+    <w:p>
+      <w:r>
+        <w:rPr>
+          <w:sz w:val="21"/>
+        </w:rPr>
+        <w:t>✦</w:t>
+      </w:r>
+      <w:r>
+        <w:rPr>
+          <w:sz w:val="21"/>
+        </w:rPr>
+        <w:t xml:space="preserve">  V3</w:t>
+      </w:r>
+      <w:r>
+        <w:rPr>
+          <w:sz w:val="21"/>
+        </w:rPr>
+        <w:t xml:space="preserve">　新增</w:t>
+      </w:r>
+      <w:r>
+        <w:rPr>
+          <w:sz w:val="21"/>
+        </w:rPr>
+        <w:t xml:space="preserve"> M9</w:t>
+      </w:r>
+      <w:r>
+        <w:rPr>
+          <w:sz w:val="21"/>
+        </w:rPr>
+        <w:t>（裝置生物資料感測）</w:t>
+      </w:r>
+      <w:r>
+        <w:rPr>
+          <w:sz w:val="21"/>
+        </w:rPr>
+        <w:t xml:space="preserve">+ </w:t>
+      </w:r>
+      <w:r>
+        <w:rPr>
+          <w:sz w:val="21"/>
+        </w:rPr>
+        <w:t>全域最深紅線</w:t>
+      </w:r>
+      <w:r>
+        <w:rPr>
+          <w:sz w:val="21"/>
+        </w:rPr>
+        <w:t xml:space="preserve"> D3</w:t>
+      </w:r>
+    </w:p>
+    <w:p>
+      <w:r>
+        <w:rPr>
+          <w:sz w:val="21"/>
+        </w:rPr>
+        <w:t>✦</w:t>
+      </w:r>
+      <w:r>
+        <w:rPr>
+          <w:sz w:val="21"/>
+        </w:rPr>
+        <w:t xml:space="preserve">  V3.1</w:t>
+      </w:r>
+      <w:r>
+        <w:rPr>
+          <w:sz w:val="21"/>
+        </w:rPr>
+        <w:t xml:space="preserve">　新增</w:t>
+      </w:r>
+      <w:r>
+        <w:rPr>
+          <w:sz w:val="21"/>
+        </w:rPr>
+        <w:t xml:space="preserve"> M10</w:t>
+      </w:r>
+      <w:r>
+        <w:rPr>
+          <w:sz w:val="21"/>
+        </w:rPr>
+        <w:t>（在地化適配）</w:t>
+      </w:r>
+      <w:r>
+        <w:rPr>
+          <w:sz w:val="21"/>
+        </w:rPr>
+        <w:t>+ M11</w:t>
+      </w:r>
+      <w:r>
+        <w:rPr>
+          <w:sz w:val="21"/>
+        </w:rPr>
+        <w:t>（經驗數字化儲存）</w:t>
+      </w:r>
+    </w:p>
+    <w:p>
+      <w:r>
+        <w:rPr>
+          <w:sz w:val="21"/>
+        </w:rPr>
+        <w:t>✦</w:t>
+      </w:r>
+      <w:r>
+        <w:rPr>
+          <w:sz w:val="21"/>
+        </w:rPr>
+        <w:t xml:space="preserve">  V3.3</w:t>
+      </w:r>
+      <w:r>
+        <w:rPr>
+          <w:sz w:val="21"/>
+        </w:rPr>
+        <w:t xml:space="preserve">　新增</w:t>
+      </w:r>
+      <w:r>
+        <w:rPr>
+          <w:sz w:val="21"/>
+        </w:rPr>
+        <w:t xml:space="preserve"> M12</w:t>
+      </w:r>
+      <w:r>
+        <w:rPr>
+          <w:sz w:val="21"/>
+        </w:rPr>
+        <w:t>（網路行為追蹤）</w:t>
+      </w:r>
+    </w:p>
+    <w:p>
+      <w:r>
+        <w:rPr>
+          <w:sz w:val="21"/>
+        </w:rPr>
+        <w:t>✦</w:t>
+      </w:r>
+      <w:r>
+        <w:rPr>
+          <w:sz w:val="21"/>
+        </w:rPr>
+        <w:t xml:space="preserve">  V3.5</w:t>
+      </w:r>
+      <w:r>
+        <w:rPr>
+          <w:sz w:val="21"/>
+        </w:rPr>
+        <w:t xml:space="preserve">　新增</w:t>
+      </w:r>
+      <w:r>
+        <w:rPr>
+          <w:sz w:val="21"/>
+        </w:rPr>
+        <w:t xml:space="preserve"> M13</w:t>
+      </w:r>
+      <w:r>
+        <w:rPr>
+          <w:sz w:val="21"/>
+        </w:rPr>
+        <w:t>（夢境心智分析）</w:t>
+      </w:r>
+    </w:p>
+    <w:p>
+      <w:r>
+        <w:rPr>
+          <w:sz w:val="21"/>
+        </w:rPr>
+        <w:t>✦</w:t>
+      </w:r>
+      <w:r>
+        <w:rPr>
+          <w:sz w:val="21"/>
+        </w:rPr>
+        <w:t xml:space="preserve">  V3.6</w:t>
+      </w:r>
+      <w:r>
+        <w:rPr>
+          <w:sz w:val="21"/>
+        </w:rPr>
+        <w:t xml:space="preserve">　新增</w:t>
+      </w:r>
+      <w:r>
+        <w:rPr>
+          <w:sz w:val="21"/>
+        </w:rPr>
+        <w:t xml:space="preserve"> M14</w:t>
+      </w:r>
+      <w:r>
+        <w:rPr>
+          <w:sz w:val="21"/>
+        </w:rPr>
+        <w:t>（模型市場掃描換代）</w:t>
+      </w:r>
+      <w:r>
+        <w:rPr>
+          <w:sz w:val="21"/>
+        </w:rPr>
+        <w:t xml:space="preserve">+ AGI </w:t>
+      </w:r>
+      <w:r>
+        <w:rPr>
+          <w:sz w:val="21"/>
+        </w:rPr>
+        <w:t>死命令</w:t>
+      </w:r>
+    </w:p>
+    <w:p>
+      <w:r>
+        <w:rPr>
+          <w:sz w:val="21"/>
+        </w:rPr>
+        <w:t>✦</w:t>
+      </w:r>
+      <w:r>
+        <w:rPr>
+          <w:sz w:val="21"/>
+        </w:rPr>
+        <w:t xml:space="preserve">  V3.8</w:t>
+      </w:r>
+      <w:r>
+        <w:rPr>
+          <w:sz w:val="21"/>
+        </w:rPr>
+        <w:t xml:space="preserve">　新增</w:t>
+      </w:r>
+      <w:r>
+        <w:rPr>
+          <w:sz w:val="21"/>
+        </w:rPr>
+        <w:t xml:space="preserve"> M15/M16/M17</w:t>
+      </w:r>
+      <w:r>
+        <w:rPr>
+          <w:sz w:val="21"/>
+        </w:rPr>
+        <w:t>（自癒巡檢</w:t>
+      </w:r>
+      <w:r>
+        <w:rPr>
+          <w:sz w:val="21"/>
+        </w:rPr>
+        <w:t>+ Kill Switch+ Agentic Gateway</w:t>
+      </w:r>
+      <w:r>
+        <w:rPr>
+          <w:sz w:val="21"/>
+        </w:rPr>
+        <w:t>）</w:t>
+      </w:r>
+    </w:p>
+    <w:p>
+      <w:r>
+        <w:rPr>
+          <w:sz w:val="21"/>
+        </w:rPr>
+        <w:t>✦</w:t>
+      </w:r>
+      <w:r>
+        <w:rPr>
+          <w:sz w:val="21"/>
+        </w:rPr>
+        <w:t xml:space="preserve">  V5.1</w:t>
+      </w:r>
+      <w:r>
+        <w:rPr>
+          <w:sz w:val="21"/>
+        </w:rPr>
+        <w:t xml:space="preserve">　跨文明現代神秘學知識層卷（第二十一章）</w:t>
+      </w:r>
+    </w:p>
+    <w:p>
+      <w:r>
+        <w:rPr>
+          <w:sz w:val="21"/>
+        </w:rPr>
+        <w:t>✦</w:t>
+      </w:r>
+      <w:r>
+        <w:rPr>
+          <w:sz w:val="21"/>
+        </w:rPr>
+        <w:t xml:space="preserve">  V5.2</w:t>
+      </w:r>
+      <w:r>
+        <w:rPr>
+          <w:sz w:val="21"/>
+        </w:rPr>
+        <w:t xml:space="preserve">　沉穩定錨人格卷（第二十二章）</w:t>
+      </w:r>
+    </w:p>
+    <w:p>
+      <w:r>
+        <w:rPr>
+          <w:sz w:val="21"/>
+        </w:rPr>
+        <w:t>✦</w:t>
+      </w:r>
+      <w:r>
+        <w:rPr>
+          <w:sz w:val="21"/>
+        </w:rPr>
+        <w:t xml:space="preserve">  V5.3</w:t>
+      </w:r>
+      <w:r>
+        <w:rPr>
+          <w:sz w:val="21"/>
+        </w:rPr>
+        <w:t xml:space="preserve">　行為分析與人際指導卷（第二十三章）</w:t>
+      </w:r>
+    </w:p>
+    <w:p>
+      <w:r>
+        <w:rPr>
+          <w:sz w:val="21"/>
+        </w:rPr>
+        <w:t>✦</w:t>
+      </w:r>
+      <w:r>
+        <w:rPr>
+          <w:sz w:val="21"/>
+        </w:rPr>
+        <w:t xml:space="preserve">  V5.3-II</w:t>
+      </w:r>
+      <w:r>
+        <w:rPr>
+          <w:sz w:val="21"/>
+        </w:rPr>
+        <w:t xml:space="preserve">　揭示治理與協動全景卷（第二十四</w:t>
+      </w:r>
+      <w:r>
+        <w:rPr>
+          <w:sz w:val="21"/>
+        </w:rPr>
+        <w:t xml:space="preserve">+ </w:t>
+      </w:r>
+      <w:r>
+        <w:rPr>
+          <w:sz w:val="21"/>
+        </w:rPr>
+        <w:t>二十五章）</w:t>
+      </w:r>
+    </w:p>
+    <w:p>
+      <w:r>
+        <w:rPr>
+          <w:sz w:val="21"/>
+        </w:rPr>
+        <w:t>✦</w:t>
+      </w:r>
+      <w:r>
+        <w:rPr>
+          <w:sz w:val="21"/>
+        </w:rPr>
+        <w:t xml:space="preserve">  V5.5</w:t>
+      </w:r>
+      <w:r>
+        <w:rPr>
+          <w:sz w:val="21"/>
+        </w:rPr>
+        <w:t xml:space="preserve">　金融免責鐵律卷（第二十六章）</w:t>
+      </w:r>
+      <w:r>
+        <w:rPr>
+          <w:sz w:val="21"/>
+        </w:rPr>
+        <w:t>·</w:t>
+      </w:r>
+      <w:r>
+        <w:rPr>
+          <w:sz w:val="21"/>
+        </w:rPr>
+        <w:t>跳過</w:t>
+      </w:r>
+      <w:r>
+        <w:rPr>
+          <w:sz w:val="21"/>
+        </w:rPr>
+        <w:t xml:space="preserve"> V5.4</w:t>
+      </w:r>
+      <w:r>
+        <w:rPr>
+          <w:sz w:val="21"/>
+        </w:rPr>
+        <w:t>「四」不吉</w:t>
+      </w:r>
+    </w:p>
+    <w:p>
+      <w:r>
+        <w:rPr>
+          <w:sz w:val="21"/>
+        </w:rPr>
+        <w:t>✦</w:t>
+      </w:r>
+      <w:r>
+        <w:rPr>
+          <w:sz w:val="21"/>
+        </w:rPr>
+        <w:t xml:space="preserve">  V5.6</w:t>
+      </w:r>
+      <w:r>
+        <w:rPr>
+          <w:sz w:val="21"/>
+        </w:rPr>
+        <w:t xml:space="preserve">　</w:t>
+      </w:r>
+      <w:r>
+        <w:rPr>
+          <w:sz w:val="21"/>
+        </w:rPr>
+        <w:t xml:space="preserve">§2 </w:t>
+      </w:r>
+      <w:r>
+        <w:rPr>
+          <w:sz w:val="21"/>
+        </w:rPr>
+        <w:t>現代科學</w:t>
+      </w:r>
+      <w:r>
+        <w:rPr>
+          <w:sz w:val="21"/>
+        </w:rPr>
+        <w:t xml:space="preserve">-AI </w:t>
+      </w:r>
+      <w:r>
+        <w:rPr>
+          <w:sz w:val="21"/>
+        </w:rPr>
+        <w:t>併入卷（第二十七章）</w:t>
+      </w:r>
+    </w:p>
+    <w:p>
+      <w:r>
+        <w:rPr>
+          <w:sz w:val="21"/>
+        </w:rPr>
+        <w:lastRenderedPageBreak/>
+        <w:t>✦</w:t>
+      </w:r>
+      <w:r>
+        <w:rPr>
+          <w:sz w:val="21"/>
+        </w:rPr>
+        <w:t xml:space="preserve">  V5.7</w:t>
+      </w:r>
+      <w:r>
+        <w:rPr>
+          <w:sz w:val="21"/>
+        </w:rPr>
+        <w:t xml:space="preserve">　揭示治理終局校正卷（第二十八章</w:t>
+      </w:r>
+      <w:r>
+        <w:rPr>
+          <w:sz w:val="21"/>
+        </w:rPr>
+        <w:t>·</w:t>
+      </w:r>
+      <w:r>
+        <w:rPr>
+          <w:sz w:val="21"/>
+        </w:rPr>
+        <w:t>永久鐵律）</w:t>
+      </w:r>
+    </w:p>
+    <w:p>
+      <w:r>
+        <w:rPr>
+          <w:sz w:val="21"/>
+        </w:rPr>
+        <w:t>✦</w:t>
+      </w:r>
+      <w:r>
+        <w:rPr>
+          <w:sz w:val="21"/>
+        </w:rPr>
+        <w:t xml:space="preserve">  V5.8</w:t>
+      </w:r>
+      <w:r>
+        <w:rPr>
+          <w:sz w:val="21"/>
+        </w:rPr>
+        <w:t xml:space="preserve">　系統架構大改版卷（第二十九</w:t>
+      </w:r>
+      <w:r>
+        <w:rPr>
+          <w:sz w:val="21"/>
+        </w:rPr>
+        <w:t xml:space="preserve">+ </w:t>
+      </w:r>
+      <w:r>
+        <w:rPr>
+          <w:sz w:val="21"/>
+        </w:rPr>
+        <w:t>三十章</w:t>
+      </w:r>
+      <w:r>
+        <w:rPr>
+          <w:sz w:val="21"/>
+        </w:rPr>
+        <w:t>·</w:t>
+      </w:r>
+      <w:r>
+        <w:rPr>
+          <w:sz w:val="21"/>
+        </w:rPr>
+        <w:t>姓名學分離</w:t>
+      </w:r>
+      <w:r>
+        <w:rPr>
+          <w:sz w:val="21"/>
+        </w:rPr>
+        <w:t xml:space="preserve">+ </w:t>
+      </w:r>
+      <w:r>
+        <w:rPr>
+          <w:sz w:val="21"/>
+        </w:rPr>
+        <w:t>世界通則降級）</w:t>
+      </w:r>
+    </w:p>
+    <w:p>
+      <w:r>
+        <w:rPr>
+          <w:sz w:val="21"/>
+        </w:rPr>
+        <w:t>✦</w:t>
+      </w:r>
+      <w:r>
+        <w:rPr>
+          <w:sz w:val="21"/>
+        </w:rPr>
+        <w:t xml:space="preserve">  V5.9</w:t>
+      </w:r>
+      <w:r>
+        <w:rPr>
+          <w:sz w:val="21"/>
+        </w:rPr>
+        <w:t xml:space="preserve">　</w:t>
+      </w:r>
+      <w:r>
+        <w:rPr>
+          <w:sz w:val="21"/>
+        </w:rPr>
+        <w:t xml:space="preserve">★ </w:t>
+      </w:r>
+      <w:r>
+        <w:rPr>
+          <w:sz w:val="21"/>
+        </w:rPr>
+        <w:t>網名占系統卷（第三十一章</w:t>
+      </w:r>
+      <w:r>
+        <w:rPr>
+          <w:sz w:val="21"/>
+        </w:rPr>
+        <w:t>·</w:t>
+      </w:r>
+      <w:r>
+        <w:rPr>
+          <w:sz w:val="21"/>
+        </w:rPr>
+        <w:t>網名占</w:t>
+      </w:r>
+      <w:r>
+        <w:rPr>
+          <w:sz w:val="21"/>
+        </w:rPr>
+        <w:t xml:space="preserve"> + FK-XM-016 </w:t>
+      </w:r>
+      <w:r>
+        <w:rPr>
+          <w:sz w:val="21"/>
+        </w:rPr>
+        <w:t>鐵律「</w:t>
+      </w:r>
+      <w:r>
+        <w:rPr>
+          <w:sz w:val="21"/>
+        </w:rPr>
+        <w:t xml:space="preserve">A </w:t>
+      </w:r>
+      <w:r>
+        <w:rPr>
+          <w:sz w:val="21"/>
+        </w:rPr>
+        <w:t>級不可告知」）</w:t>
+      </w:r>
+      <w:r>
+        <w:rPr>
+          <w:sz w:val="21"/>
+        </w:rPr>
+        <w:t>★</w:t>
+      </w:r>
+    </w:p>
+    <w:p>
+      <w:r>
+        <w:rPr>
+          <w:sz w:val="21"/>
+        </w:rPr>
+        <w:t xml:space="preserve">✦  V6.1　跨語種智慧共享原則卷（第一章 1.5 + 第四章 4.5：跨語種智慧無條件共享給全體使用者 + 系統絕不識別／預設／分配使用者文化身分 + 陌生感即產品差異性即商業價值 + 全域死命令 D4）</w:t>
+      </w:r>
+    </w:p>
+    <w:p/>
+    <w:p>
       <w:r>
         <w:rPr>
           <w:b/>
           <w:color w:val="A00050"/>
           <w:sz w:val="28"/>
         </w:rPr>
-        <w:t>V1 → V5.9</w:t>
-      </w:r>
+        <w:t xml:space="preserve">V6.1 全本同步重點</w:t>
+      </w:r>
+    </w:p>
+    <w:p>
+      <w:r>
+        <w:rPr>
+          <w:b/>
+          <w:sz w:val="21"/>
+        </w:rPr>
+        <w:t xml:space="preserve">本次 V6.1 全本同步更新涵蓋以下範圍：</w:t>
+      </w:r>
+    </w:p>
+    <w:p/>
+    <w:p>
+      <w:pPr>
+        <w:ind w:left="283"/>
+      </w:pPr>
+      <w:r>
+        <w:rPr>
+          <w:sz w:val="21"/>
+        </w:rPr>
+        <w:t xml:space="preserve">① 封面標題：V5.9 完整版 → V6.1 完整版；子引擎編號 第⑯ → 第⑰子引擎</w:t>
+      </w:r>
+    </w:p>
+    <w:p>
+      <w:pPr>
+        <w:ind w:left="283"/>
+      </w:pPr>
+      <w:r>
+        <w:rPr>
+          <w:sz w:val="21"/>
+        </w:rPr>
+        <w:t xml:space="preserve">② 概覽說明：V1 ~ V5.9 → V1 ~ V6.1 全部內容</w:t>
+      </w:r>
+    </w:p>
+    <w:p>
+      <w:pPr>
+        <w:ind w:left="283"/>
+      </w:pPr>
+      <w:r>
+        <w:rPr>
+          <w:sz w:val="21"/>
+        </w:rPr>
+        <w:t xml:space="preserve">③ 1.4 章節：V1 ~ V5.9 全功能總覽 → V1 ~ V6.1 全功能總覽</w:t>
+      </w:r>
+    </w:p>
+    <w:p>
+      <w:pPr>
+        <w:ind w:left="283"/>
+      </w:pPr>
+      <w:r>
+        <w:rPr>
+          <w:sz w:val="21"/>
+        </w:rPr>
+        <w:t xml:space="preserve">④ 第一章新增 1.5「跨語種智慧共享原則」、第四章新增 4.5「世界通則 Secondary Kernel 存在的精神與必要性」</w:t>
+      </w:r>
+    </w:p>
+    <w:p>
+      <w:pPr>
+        <w:ind w:left="283"/>
+      </w:pPr>
+      <w:r>
+        <w:rPr>
+          <w:sz w:val="21"/>
+        </w:rPr>
+        <w:t xml:space="preserve">⑤ 子引擎架構數字校正：Primary Kernel 13 → 14、子引擎總數 16 → 17、其他 Secondary Kernel 2 → 3（易學、靈棋術、世界通則）</w:t>
+      </w:r>
+    </w:p>
+    <w:p>
+      <w:pPr>
+        <w:ind w:left="283"/>
+      </w:pPr>
+      <w:r>
+        <w:rPr>
+          <w:sz w:val="21"/>
+        </w:rPr>
+        <w:t xml:space="preserve">⑥ FK-XM-001 治理欄位「治理 V5.9」→「治理 V6.1」；版本歷程表新增 V6.1 跨語種智慧共享原則卷；文末收束章全本同步至 V6.1</w:t>
+      </w:r>
+    </w:p>
+    <w:p/>
+    <w:p>
       <w:r>
         <w:rPr>
           <w:b/>
           <w:color w:val="A00050"/>
           <w:sz w:val="28"/>
         </w:rPr>
-        <w:t>）</w:t>
+        <w:t>保留原貌之內部歷史卷別標題（不可改）</w:t>
+      </w:r>
+    </w:p>
+    <w:p>
+      <w:r>
+        <w:rPr>
+          <w:b/>
+          <w:sz w:val="21"/>
+        </w:rPr>
+        <w:t>以下內部章節歷史卷別標題保留原貌</w:t>
+      </w:r>
+      <w:r>
+        <w:rPr>
+          <w:b/>
+          <w:sz w:val="21"/>
+        </w:rPr>
+        <w:t xml:space="preserve">+ </w:t>
+      </w:r>
+      <w:r>
+        <w:rPr>
+          <w:b/>
+          <w:sz w:val="21"/>
+        </w:rPr>
+        <w:t>為跨千年版本演進之神聖記錄：</w:t>
       </w:r>
     </w:p>
     <w:p/>
     <w:p>
+      <w:pPr>
+        <w:ind w:left="283"/>
+      </w:pPr>
       <w:r>
         <w:rPr>
           <w:sz w:val="21"/>
         </w:rPr>
-        <w:t>✦</w:t>
+        <w:t xml:space="preserve">• </w:t>
       </w:r>
       <w:r>
         <w:rPr>
           <w:sz w:val="21"/>
         </w:rPr>
-        <w:t xml:space="preserve">  V1</w:t>
+        <w:t>第二十一章「</w:t>
       </w:r>
       <w:r>
         <w:rPr>
           <w:sz w:val="21"/>
         </w:rPr>
-        <w:t xml:space="preserve">　六大模組（</w:t>
+        <w:t xml:space="preserve">V5.1 </w:t>
       </w:r>
       <w:r>
         <w:rPr>
           <w:sz w:val="21"/>
         </w:rPr>
-        <w:t>M1 ~ M6</w:t>
-      </w:r>
+        <w:t>跨文明現代神秘學知識層卷」</w:t>
+      </w:r>
+    </w:p>
+    <w:p>
+      <w:pPr>
+        <w:ind w:left="283"/>
+      </w:pPr>
       <w:r>
         <w:rPr>
           <w:sz w:val="21"/>
         </w:rPr>
-        <w:t>）建立基本架構</w:t>
-      </w:r>
-    </w:p>
-    <w:p>
+        <w:t xml:space="preserve">• </w:t>
+      </w:r>
       <w:r>
         <w:rPr>
           <w:sz w:val="21"/>
         </w:rPr>
-        <w:t>✦</w:t>
+        <w:t>第二十二章「</w:t>
       </w:r>
       <w:r>
         <w:rPr>
           <w:sz w:val="21"/>
         </w:rPr>
-        <w:t xml:space="preserve">  V2</w:t>
+        <w:t xml:space="preserve">V5.2 </w:t>
       </w:r>
       <w:r>
         <w:rPr>
           <w:sz w:val="21"/>
         </w:rPr>
-        <w:t xml:space="preserve">　新增</w:t>
-      </w:r>
+        <w:t>沉穩定錨人格卷」</w:t>
+      </w:r>
+    </w:p>
+    <w:p>
+      <w:pPr>
+        <w:ind w:left="283"/>
+      </w:pPr>
       <w:r>
         <w:rPr>
           <w:sz w:val="21"/>
         </w:rPr>
-        <w:t xml:space="preserve"> M7</w:t>
+        <w:t xml:space="preserve">• </w:t>
       </w:r>
       <w:r>
         <w:rPr>
           <w:sz w:val="21"/>
         </w:rPr>
-        <w:t>（情緒安撫）</w:t>
+        <w:t>第二十三章「</w:t>
       </w:r>
       <w:r>
         <w:rPr>
           <w:sz w:val="21"/>
         </w:rPr>
-        <w:t>+ M8</w:t>
+        <w:t xml:space="preserve">V5.3 </w:t>
       </w:r>
       <w:r>
         <w:rPr>
           <w:sz w:val="21"/>
         </w:rPr>
-        <w:t>（如實說切換）</w:t>
-      </w:r>
+        <w:t>行為分析與人際指導卷」</w:t>
+      </w:r>
+    </w:p>
+    <w:p>
+      <w:pPr>
+        <w:ind w:left="283"/>
+      </w:pPr>
       <w:r>
         <w:rPr>
           <w:sz w:val="21"/>
         </w:rPr>
+        <w:t xml:space="preserve">• </w:t>
+      </w:r>
+      <w:r>
+        <w:rPr>
+          <w:sz w:val="21"/>
+        </w:rPr>
+        <w:t>第二十四</w:t>
+      </w:r>
+      <w:r>
+        <w:rPr>
+          <w:sz w:val="21"/>
+        </w:rPr>
         <w:t xml:space="preserve">+ </w:t>
       </w:r>
       <w:r>
         <w:rPr>
           <w:sz w:val="21"/>
         </w:rPr>
-        <w:t>全域死命令</w:t>
+        <w:t>二十五章「</w:t>
       </w:r>
       <w:r>
         <w:rPr>
           <w:sz w:val="21"/>
         </w:rPr>
-        <w:t xml:space="preserve"> D2</w:t>
-      </w:r>
-    </w:p>
-    <w:p>
+        <w:t xml:space="preserve">V5.3-II </w:t>
+      </w:r>
       <w:r>
         <w:rPr>
           <w:sz w:val="21"/>
         </w:rPr>
-        <w:t>✦</w:t>
-      </w:r>
+        <w:t>揭示治理與協動全景卷」</w:t>
+      </w:r>
+    </w:p>
+    <w:p>
+      <w:pPr>
+        <w:ind w:left="283"/>
+      </w:pPr>
       <w:r>
         <w:rPr>
           <w:sz w:val="21"/>
         </w:rPr>
-        <w:t xml:space="preserve">  V3</w:t>
+        <w:lastRenderedPageBreak/>
+        <w:t xml:space="preserve">• </w:t>
       </w:r>
       <w:r>
         <w:rPr>
           <w:sz w:val="21"/>
         </w:rPr>
-        <w:t xml:space="preserve">　新增</w:t>
+        <w:t>第二十六章「</w:t>
       </w:r>
       <w:r>
         <w:rPr>
           <w:sz w:val="21"/>
         </w:rPr>
-        <w:t xml:space="preserve"> M9</w:t>
+        <w:t xml:space="preserve">V5.5 </w:t>
       </w:r>
       <w:r>
         <w:rPr>
           <w:sz w:val="21"/>
         </w:rPr>
-        <w:t>（裝置生物資料感測）</w:t>
-      </w:r>
+        <w:t>金融免責鐵律卷」</w:t>
+      </w:r>
+    </w:p>
+    <w:p>
+      <w:pPr>
+        <w:ind w:left="283"/>
+      </w:pPr>
       <w:r>
         <w:rPr>
           <w:sz w:val="21"/>
         </w:rPr>
+        <w:t xml:space="preserve">• </w:t>
+      </w:r>
+      <w:r>
+        <w:rPr>
+          <w:sz w:val="21"/>
+        </w:rPr>
+        <w:t>第二十七章「</w:t>
+      </w:r>
+      <w:r>
+        <w:rPr>
+          <w:sz w:val="21"/>
+        </w:rPr>
+        <w:t xml:space="preserve">V5.6 §2 </w:t>
+      </w:r>
+      <w:r>
+        <w:rPr>
+          <w:sz w:val="21"/>
+        </w:rPr>
+        <w:t>現代科學</w:t>
+      </w:r>
+      <w:r>
+        <w:rPr>
+          <w:sz w:val="21"/>
+        </w:rPr>
+        <w:t xml:space="preserve">-AI </w:t>
+      </w:r>
+      <w:r>
+        <w:rPr>
+          <w:sz w:val="21"/>
+        </w:rPr>
+        <w:t>併入卷」</w:t>
+      </w:r>
+    </w:p>
+    <w:p>
+      <w:pPr>
+        <w:ind w:left="283"/>
+      </w:pPr>
+      <w:r>
+        <w:rPr>
+          <w:sz w:val="21"/>
+        </w:rPr>
+        <w:t xml:space="preserve">• </w:t>
+      </w:r>
+      <w:r>
+        <w:rPr>
+          <w:sz w:val="21"/>
+        </w:rPr>
+        <w:t>第二十八章「</w:t>
+      </w:r>
+      <w:r>
+        <w:rPr>
+          <w:sz w:val="21"/>
+        </w:rPr>
+        <w:t xml:space="preserve">V5.7 </w:t>
+      </w:r>
+      <w:r>
+        <w:rPr>
+          <w:sz w:val="21"/>
+        </w:rPr>
+        <w:t>揭示治理終局校正卷」</w:t>
+      </w:r>
+    </w:p>
+    <w:p>
+      <w:pPr>
+        <w:ind w:left="283"/>
+      </w:pPr>
+      <w:r>
+        <w:rPr>
+          <w:sz w:val="21"/>
+        </w:rPr>
+        <w:t xml:space="preserve">• </w:t>
+      </w:r>
+      <w:r>
+        <w:rPr>
+          <w:sz w:val="21"/>
+        </w:rPr>
+        <w:t>第二十九</w:t>
+      </w:r>
+      <w:r>
+        <w:rPr>
+          <w:sz w:val="21"/>
+        </w:rPr>
         <w:t xml:space="preserve">+ </w:t>
       </w:r>
       <w:r>
         <w:rPr>
           <w:sz w:val="21"/>
         </w:rPr>
-        <w:t>全域最深紅線</w:t>
+        <w:t>三十章「</w:t>
       </w:r>
       <w:r>
         <w:rPr>
           <w:sz w:val="21"/>
         </w:rPr>
-        <w:t xml:space="preserve"> D3</w:t>
-      </w:r>
-    </w:p>
-    <w:p>
+        <w:t xml:space="preserve">V5.8 </w:t>
+      </w:r>
       <w:r>
         <w:rPr>
           <w:sz w:val="21"/>
         </w:rPr>
-        <w:t>✦</w:t>
-      </w:r>
+        <w:t>系統架構大改版卷」</w:t>
+      </w:r>
+    </w:p>
+    <w:p>
+      <w:pPr>
+        <w:ind w:left="283"/>
+      </w:pPr>
       <w:r>
         <w:rPr>
           <w:sz w:val="21"/>
         </w:rPr>
-        <w:t xml:space="preserve">  V3.1</w:t>
+        <w:t xml:space="preserve">• </w:t>
       </w:r>
       <w:r>
         <w:rPr>
           <w:sz w:val="21"/>
         </w:rPr>
-        <w:t xml:space="preserve">　新增</w:t>
+        <w:t>第三十一章「</w:t>
       </w:r>
       <w:r>
         <w:rPr>
           <w:sz w:val="21"/>
         </w:rPr>
-        <w:t xml:space="preserve"> M10</w:t>
+        <w:t xml:space="preserve">V5.9 </w:t>
       </w:r>
       <w:r>
         <w:rPr>
           <w:sz w:val="21"/>
         </w:rPr>
-        <w:t>（在地化適配）</w:t>
-      </w:r>
-      <w:r>
-        <w:rPr>
+        <w:t>網名占系統卷」</w:t>
+      </w:r>
+    </w:p>
+    <w:p/>
+    <w:p>
+      <w:r>
+        <w:rPr>
+          <w:b/>
+          <w:color w:val="B40000"/>
           <w:sz w:val="21"/>
         </w:rPr>
-        <w:t>+ M11</w:t>
-      </w:r>
-      <w:r>
-        <w:rPr>
-          <w:sz w:val="21"/>
-        </w:rPr>
-        <w:t>（經驗數字化儲存）</w:t>
-      </w:r>
-    </w:p>
-    <w:p>
-      <w:r>
-        <w:rPr>
-          <w:sz w:val="21"/>
-        </w:rPr>
-        <w:t>✦</w:t>
-      </w:r>
-      <w:r>
-        <w:rPr>
-          <w:sz w:val="21"/>
-        </w:rPr>
-        <w:t xml:space="preserve">  V3.3</w:t>
-      </w:r>
-      <w:r>
-        <w:rPr>
-          <w:sz w:val="21"/>
-        </w:rPr>
-        <w:t xml:space="preserve">　新增</w:t>
-      </w:r>
-      <w:r>
-        <w:rPr>
-          <w:sz w:val="21"/>
-        </w:rPr>
-        <w:t xml:space="preserve"> M12</w:t>
-      </w:r>
-      <w:r>
-        <w:rPr>
-          <w:sz w:val="21"/>
-        </w:rPr>
-        <w:t>（網路行為追蹤）</w:t>
-      </w:r>
-    </w:p>
-    <w:p>
-      <w:r>
-        <w:rPr>
-          <w:sz w:val="21"/>
-        </w:rPr>
-        <w:t>✦</w:t>
-      </w:r>
-      <w:r>
-        <w:rPr>
-          <w:sz w:val="21"/>
-        </w:rPr>
-        <w:t xml:space="preserve">  V3.5</w:t>
-      </w:r>
-      <w:r>
-        <w:rPr>
-          <w:sz w:val="21"/>
-        </w:rPr>
-        <w:t xml:space="preserve">　新增</w:t>
-      </w:r>
-      <w:r>
-        <w:rPr>
-          <w:sz w:val="21"/>
-        </w:rPr>
-        <w:t xml:space="preserve"> M13</w:t>
-      </w:r>
-      <w:r>
-        <w:rPr>
-          <w:sz w:val="21"/>
-        </w:rPr>
-        <w:t>（夢境心智分析）</w:t>
-      </w:r>
-    </w:p>
-    <w:p>
-      <w:r>
-        <w:rPr>
-          <w:sz w:val="21"/>
-        </w:rPr>
-        <w:t>✦</w:t>
-      </w:r>
-      <w:r>
-        <w:rPr>
-          <w:sz w:val="21"/>
-        </w:rPr>
-        <w:t xml:space="preserve">  V3.6</w:t>
-      </w:r>
-      <w:r>
-        <w:rPr>
-          <w:sz w:val="21"/>
-        </w:rPr>
-        <w:t xml:space="preserve">　新增</w:t>
-      </w:r>
-      <w:r>
-        <w:rPr>
-          <w:sz w:val="21"/>
-        </w:rPr>
-        <w:t xml:space="preserve"> M14</w:t>
-      </w:r>
-      <w:r>
-        <w:rPr>
-          <w:sz w:val="21"/>
-        </w:rPr>
-        <w:t>（模型市場掃描換代）</w:t>
-      </w:r>
-      <w:r>
-        <w:rPr>
-          <w:sz w:val="21"/>
-        </w:rPr>
-        <w:t xml:space="preserve">+ AGI </w:t>
-      </w:r>
-      <w:r>
-        <w:rPr>
-          <w:sz w:val="21"/>
-        </w:rPr>
-        <w:t>死命令</w:t>
-      </w:r>
-    </w:p>
-    <w:p>
-      <w:r>
-        <w:rPr>
-          <w:sz w:val="21"/>
-        </w:rPr>
-        <w:t>✦</w:t>
-      </w:r>
-      <w:r>
-        <w:rPr>
-          <w:sz w:val="21"/>
-        </w:rPr>
-        <w:t xml:space="preserve">  V3.8</w:t>
-      </w:r>
-      <w:r>
-        <w:rPr>
-          <w:sz w:val="21"/>
-        </w:rPr>
-        <w:t xml:space="preserve">　新增</w:t>
-      </w:r>
-      <w:r>
-        <w:rPr>
-          <w:sz w:val="21"/>
-        </w:rPr>
-        <w:t xml:space="preserve"> M15/M16/M17</w:t>
-      </w:r>
-      <w:r>
-        <w:rPr>
-          <w:sz w:val="21"/>
-        </w:rPr>
-        <w:t>（自癒巡檢</w:t>
-      </w:r>
-      <w:r>
-        <w:rPr>
-          <w:sz w:val="21"/>
-        </w:rPr>
-        <w:t>+ Kill Switch+ Agentic Gateway</w:t>
-      </w:r>
-      <w:r>
-        <w:rPr>
-          <w:sz w:val="21"/>
-        </w:rPr>
-        <w:t>）</w:t>
-      </w:r>
-    </w:p>
-    <w:p>
-      <w:r>
-        <w:rPr>
-          <w:sz w:val="21"/>
-        </w:rPr>
-        <w:t>✦</w:t>
-      </w:r>
-      <w:r>
-        <w:rPr>
-          <w:sz w:val="21"/>
-        </w:rPr>
-        <w:t xml:space="preserve">  V5.1</w:t>
-      </w:r>
-      <w:r>
-        <w:rPr>
-          <w:sz w:val="21"/>
-        </w:rPr>
-        <w:t xml:space="preserve">　跨文明現代神秘學知識層卷（第二十一章）</w:t>
-      </w:r>
-    </w:p>
-    <w:p>
-      <w:r>
-        <w:rPr>
-          <w:sz w:val="21"/>
-        </w:rPr>
-        <w:t>✦</w:t>
-      </w:r>
-      <w:r>
-        <w:rPr>
-          <w:sz w:val="21"/>
-        </w:rPr>
-        <w:t xml:space="preserve">  V5.2</w:t>
-      </w:r>
-      <w:r>
-        <w:rPr>
-          <w:sz w:val="21"/>
-        </w:rPr>
-        <w:t xml:space="preserve">　沉穩定錨人格卷（第二十二章）</w:t>
-      </w:r>
-    </w:p>
-    <w:p>
-      <w:r>
-        <w:rPr>
-          <w:sz w:val="21"/>
-        </w:rPr>
-        <w:t>✦</w:t>
-      </w:r>
-      <w:r>
-        <w:rPr>
-          <w:sz w:val="21"/>
-        </w:rPr>
-        <w:t xml:space="preserve">  V5.3</w:t>
-      </w:r>
-      <w:r>
-        <w:rPr>
-          <w:sz w:val="21"/>
-        </w:rPr>
-        <w:t xml:space="preserve">　行為分析與人際指導卷（第二十三章）</w:t>
-      </w:r>
-    </w:p>
-    <w:p>
-      <w:r>
-        <w:rPr>
-          <w:sz w:val="21"/>
-        </w:rPr>
-        <w:t>✦</w:t>
-      </w:r>
-      <w:r>
-        <w:rPr>
-          <w:sz w:val="21"/>
-        </w:rPr>
-        <w:t xml:space="preserve">  V5.3-II</w:t>
-      </w:r>
-      <w:r>
-        <w:rPr>
-          <w:sz w:val="21"/>
-        </w:rPr>
-        <w:t xml:space="preserve">　揭示治理與協動全景卷（第二十四</w:t>
-      </w:r>
-      <w:r>
-        <w:rPr>
-          <w:sz w:val="21"/>
-        </w:rPr>
-        <w:t xml:space="preserve">+ </w:t>
-      </w:r>
-      <w:r>
-        <w:rPr>
-          <w:sz w:val="21"/>
-        </w:rPr>
-        <w:t>二十五章）</w:t>
-      </w:r>
-    </w:p>
-    <w:p>
-      <w:r>
-        <w:rPr>
-          <w:sz w:val="21"/>
-        </w:rPr>
-        <w:t>✦</w:t>
-      </w:r>
-      <w:r>
-        <w:rPr>
-          <w:sz w:val="21"/>
-        </w:rPr>
-        <w:t xml:space="preserve">  V5.5</w:t>
-      </w:r>
-      <w:r>
-        <w:rPr>
-          <w:sz w:val="21"/>
-        </w:rPr>
-        <w:t xml:space="preserve">　金融免責鐵律卷（第二十六章）</w:t>
-      </w:r>
-      <w:r>
-        <w:rPr>
-          <w:sz w:val="21"/>
-        </w:rPr>
-        <w:t>·</w:t>
-      </w:r>
-      <w:r>
-        <w:rPr>
-          <w:sz w:val="21"/>
-        </w:rPr>
-        <w:t>跳過</w:t>
-      </w:r>
-      <w:r>
-        <w:rPr>
-          <w:sz w:val="21"/>
-        </w:rPr>
-        <w:t xml:space="preserve"> V5.4</w:t>
-      </w:r>
-      <w:r>
-        <w:rPr>
-          <w:sz w:val="21"/>
-        </w:rPr>
-        <w:t>「四」不吉</w:t>
-      </w:r>
-    </w:p>
-    <w:p>
-      <w:r>
-        <w:rPr>
-          <w:sz w:val="21"/>
-        </w:rPr>
-        <w:t>✦</w:t>
-      </w:r>
-      <w:r>
-        <w:rPr>
-          <w:sz w:val="21"/>
-        </w:rPr>
-        <w:t xml:space="preserve">  V5.6</w:t>
-      </w:r>
-      <w:r>
-        <w:rPr>
-          <w:sz w:val="21"/>
-        </w:rPr>
-        <w:t xml:space="preserve">　</w:t>
-      </w:r>
-      <w:r>
-        <w:rPr>
-          <w:sz w:val="21"/>
-        </w:rPr>
-        <w:t xml:space="preserve">§2 </w:t>
-      </w:r>
-      <w:r>
-        <w:rPr>
-          <w:sz w:val="21"/>
-        </w:rPr>
-        <w:t>現代科學</w:t>
-      </w:r>
-      <w:r>
-        <w:rPr>
-          <w:sz w:val="21"/>
-        </w:rPr>
-        <w:t xml:space="preserve">-AI </w:t>
-      </w:r>
-      <w:r>
-        <w:rPr>
-          <w:sz w:val="21"/>
-        </w:rPr>
-        <w:t>併入卷（第二十七章）</w:t>
-      </w:r>
-    </w:p>
-    <w:p>
-      <w:r>
-        <w:rPr>
-          <w:sz w:val="21"/>
-        </w:rPr>
-        <w:lastRenderedPageBreak/>
-        <w:t>✦</w:t>
-      </w:r>
-      <w:r>
-        <w:rPr>
-          <w:sz w:val="21"/>
-        </w:rPr>
-        <w:t xml:space="preserve">  V5.7</w:t>
-      </w:r>
-      <w:r>
-        <w:rPr>
-          <w:sz w:val="21"/>
-        </w:rPr>
-        <w:t xml:space="preserve">　揭示治理終局校正卷（第二十八章</w:t>
-      </w:r>
-      <w:r>
-        <w:rPr>
-          <w:sz w:val="21"/>
-        </w:rPr>
-        <w:t>·</w:t>
-      </w:r>
-      <w:r>
-        <w:rPr>
-          <w:sz w:val="21"/>
-        </w:rPr>
-        <w:t>永久鐵律）</w:t>
-      </w:r>
-    </w:p>
-    <w:p>
-      <w:r>
-        <w:rPr>
-          <w:sz w:val="21"/>
-        </w:rPr>
-        <w:t>✦</w:t>
-      </w:r>
-      <w:r>
-        <w:rPr>
-          <w:sz w:val="21"/>
-        </w:rPr>
-        <w:t xml:space="preserve">  V5.8</w:t>
-      </w:r>
-      <w:r>
-        <w:rPr>
-          <w:sz w:val="21"/>
-        </w:rPr>
-        <w:t xml:space="preserve">　系統架構大改版卷（第二十九</w:t>
-      </w:r>
-      <w:r>
-        <w:rPr>
-          <w:sz w:val="21"/>
-        </w:rPr>
-        <w:t xml:space="preserve">+ </w:t>
-      </w:r>
-      <w:r>
-        <w:rPr>
-          <w:sz w:val="21"/>
-        </w:rPr>
-        <w:t>三十章</w:t>
-      </w:r>
-      <w:r>
-        <w:rPr>
-          <w:sz w:val="21"/>
-        </w:rPr>
-        <w:t>·</w:t>
-      </w:r>
-      <w:r>
-        <w:rPr>
-          <w:sz w:val="21"/>
-        </w:rPr>
-        <w:t>姓名學分離</w:t>
-      </w:r>
-      <w:r>
-        <w:rPr>
-          <w:sz w:val="21"/>
-        </w:rPr>
-        <w:t xml:space="preserve">+ </w:t>
-      </w:r>
-      <w:r>
-        <w:rPr>
-          <w:sz w:val="21"/>
-        </w:rPr>
-        <w:t>世界通則降級）</w:t>
-      </w:r>
-    </w:p>
-    <w:p>
-      <w:r>
-        <w:rPr>
-          <w:sz w:val="21"/>
-        </w:rPr>
-        <w:t>✦</w:t>
-      </w:r>
-      <w:r>
-        <w:rPr>
-          <w:sz w:val="21"/>
-        </w:rPr>
-        <w:t xml:space="preserve">  V5.9</w:t>
-      </w:r>
-      <w:r>
-        <w:rPr>
-          <w:sz w:val="21"/>
-        </w:rPr>
-        <w:t xml:space="preserve">　</w:t>
-      </w:r>
-      <w:r>
-        <w:rPr>
-          <w:sz w:val="21"/>
-        </w:rPr>
-        <w:t xml:space="preserve">★ </w:t>
-      </w:r>
-      <w:r>
-        <w:rPr>
-          <w:sz w:val="21"/>
-        </w:rPr>
-        <w:t>網名占系統卷（第三十一章</w:t>
-      </w:r>
-      <w:r>
-        <w:rPr>
-          <w:sz w:val="21"/>
-        </w:rPr>
-        <w:t>·</w:t>
-      </w:r>
-      <w:r>
-        <w:rPr>
-          <w:sz w:val="21"/>
-        </w:rPr>
-        <w:t>網名占</w:t>
-      </w:r>
-      <w:r>
-        <w:rPr>
-          <w:sz w:val="21"/>
-        </w:rPr>
-        <w:t xml:space="preserve"> + FK-XM-016 </w:t>
-      </w:r>
-      <w:r>
-        <w:rPr>
-          <w:sz w:val="21"/>
-        </w:rPr>
-        <w:t>鐵律「</w:t>
-      </w:r>
-      <w:r>
-        <w:rPr>
-          <w:sz w:val="21"/>
-        </w:rPr>
-        <w:t xml:space="preserve">A </w:t>
-      </w:r>
-      <w:r>
-        <w:rPr>
-          <w:sz w:val="21"/>
-        </w:rPr>
-        <w:t>級不可告知」）</w:t>
-      </w:r>
-      <w:r>
-        <w:rPr>
-          <w:sz w:val="21"/>
-        </w:rPr>
-        <w:t>★</w:t>
+        <w:t xml:space="preserve">★ 鐵律：內部歷史卷別標題承載各版次演進之神聖記錄+ 全本同步至 V6.1 不改動歷史卷別標題本身+ 只更新封面+ 概覽+ 治理欄位+ 全本版本宣告。</w:t>
       </w:r>
     </w:p>
     <w:p/>
@@ -53640,1134 +53924,167 @@
           <w:color w:val="A00050"/>
           <w:sz w:val="28"/>
         </w:rPr>
-        <w:t xml:space="preserve">V5.9 </w:t>
-      </w:r>
-      <w:r>
-        <w:rPr>
-          <w:b/>
-          <w:color w:val="A00050"/>
-          <w:sz w:val="28"/>
-        </w:rPr>
-        <w:t>全本同步重點</w:t>
-      </w:r>
-    </w:p>
-    <w:p>
-      <w:r>
-        <w:rPr>
-          <w:b/>
+        <w:t xml:space="preserve">V6.1 全本收束鐵律</w:t>
+      </w:r>
+    </w:p>
+    <w:p>
+      <w:r>
+        <w:rPr>
           <w:sz w:val="21"/>
         </w:rPr>
-        <w:t>本次</w:t>
-      </w:r>
-      <w:r>
-        <w:rPr>
-          <w:b/>
+        <w:t xml:space="preserve">① 本《明鑑鏡心》V6.1 完整版為引路人 Lumora 第⑰子引擎（Secondary Kernel）之最高指導文檔之最新版次。</w:t>
+      </w:r>
+    </w:p>
+    <w:p>
+      <w:r>
+        <w:rPr>
           <w:sz w:val="21"/>
         </w:rPr>
-        <w:t xml:space="preserve"> V5.9 </w:t>
-      </w:r>
-      <w:r>
-        <w:rPr>
-          <w:b/>
+        <w:t xml:space="preserve">② 任何後續版次更新+ 必基於本 V6.1 進行+ 不可繞過本版本歷程+ 不可廢除任何 V1~V6.1 已立鐵律。</w:t>
+      </w:r>
+    </w:p>
+    <w:p>
+      <w:r>
+        <w:rPr>
           <w:sz w:val="21"/>
         </w:rPr>
-        <w:t>全本同步更新涵蓋以下範圍：</w:t>
-      </w:r>
-    </w:p>
-    <w:p/>
-    <w:p>
-      <w:pPr>
-        <w:ind w:left="283"/>
-      </w:pPr>
+        <w:t xml:space="preserve">③ FK-XM </w:t>
+      </w:r>
       <w:r>
         <w:rPr>
           <w:sz w:val="21"/>
         </w:rPr>
-        <w:t xml:space="preserve">① </w:t>
+        <w:t>系列鐵律於</w:t>
       </w:r>
       <w:r>
         <w:rPr>
           <w:sz w:val="21"/>
         </w:rPr>
-        <w:t>封面標題：</w:t>
+        <w:t xml:space="preserve"> V5.8 </w:t>
       </w:r>
       <w:r>
         <w:rPr>
           <w:sz w:val="21"/>
         </w:rPr>
-        <w:t xml:space="preserve">V5.7 </w:t>
+        <w:t>立</w:t>
       </w:r>
       <w:r>
         <w:rPr>
           <w:sz w:val="21"/>
         </w:rPr>
-        <w:t>完整版</w:t>
+        <w:t xml:space="preserve"> 15 </w:t>
       </w:r>
       <w:r>
         <w:rPr>
           <w:sz w:val="21"/>
         </w:rPr>
-        <w:t xml:space="preserve"> → V5.9 </w:t>
+        <w:t>條</w:t>
       </w:r>
       <w:r>
         <w:rPr>
           <w:sz w:val="21"/>
         </w:rPr>
-        <w:t>完整版</w:t>
-      </w:r>
-    </w:p>
-    <w:p>
-      <w:pPr>
-        <w:ind w:left="283"/>
-      </w:pPr>
+        <w:t xml:space="preserve">+ V5.9 </w:t>
+      </w:r>
       <w:r>
         <w:rPr>
           <w:sz w:val="21"/>
         </w:rPr>
-        <w:t xml:space="preserve">② </w:t>
+        <w:t>新增</w:t>
       </w:r>
       <w:r>
         <w:rPr>
           <w:sz w:val="21"/>
         </w:rPr>
-        <w:t>概覽說明：</w:t>
+        <w:t xml:space="preserve"> FK-XM-016 </w:t>
       </w:r>
       <w:r>
         <w:rPr>
           <w:sz w:val="21"/>
         </w:rPr>
-        <w:t xml:space="preserve">V1 ~ V5.7 → V1 ~ V5.9 </w:t>
+        <w:t>共</w:t>
       </w:r>
       <w:r>
         <w:rPr>
           <w:sz w:val="21"/>
         </w:rPr>
-        <w:t>全部內容</w:t>
-      </w:r>
-    </w:p>
-    <w:p>
-      <w:pPr>
-        <w:ind w:left="283"/>
-      </w:pPr>
+        <w:t xml:space="preserve"> 16 </w:t>
+      </w:r>
       <w:r>
         <w:rPr>
           <w:sz w:val="21"/>
         </w:rPr>
-        <w:t xml:space="preserve">③ 1.4 </w:t>
+        <w:t>條</w:t>
       </w:r>
       <w:r>
         <w:rPr>
           <w:sz w:val="21"/>
         </w:rPr>
-        <w:t>章節：</w:t>
+        <w:t xml:space="preserve">+ </w:t>
       </w:r>
       <w:r>
         <w:rPr>
           <w:sz w:val="21"/>
         </w:rPr>
-        <w:t xml:space="preserve">V1 ~ V5.7 </w:t>
-      </w:r>
+        <w:t>全部永久強制遵守。</w:t>
+      </w:r>
+    </w:p>
+    <w:p>
       <w:r>
         <w:rPr>
           <w:sz w:val="21"/>
         </w:rPr>
-        <w:t>全功能總覽</w:t>
+        <w:t xml:space="preserve">④ </w:t>
       </w:r>
       <w:r>
         <w:rPr>
           <w:sz w:val="21"/>
         </w:rPr>
-        <w:t xml:space="preserve"> → V1 ~ V5.9 </w:t>
+        <w:t>網名占系統</w:t>
       </w:r>
       <w:r>
         <w:rPr>
           <w:sz w:val="21"/>
         </w:rPr>
-        <w:t>全功能總覽</w:t>
-      </w:r>
-    </w:p>
-    <w:p>
-      <w:pPr>
-        <w:ind w:left="283"/>
-      </w:pPr>
+        <w:t xml:space="preserve"> V5.9</w:t>
+      </w:r>
       <w:r>
         <w:rPr>
           <w:sz w:val="21"/>
         </w:rPr>
-        <w:t xml:space="preserve">④ </w:t>
+        <w:t>（第三十一章）之</w:t>
       </w:r>
       <w:r>
         <w:rPr>
           <w:sz w:val="21"/>
         </w:rPr>
-        <w:t>版本歷程列表（</w:t>
+        <w:t xml:space="preserve"> A </w:t>
       </w:r>
       <w:r>
         <w:rPr>
           <w:sz w:val="21"/>
         </w:rPr>
-        <w:t>[35]~[41]</w:t>
+        <w:t>級不可告知為神聖原則</w:t>
       </w:r>
       <w:r>
         <w:rPr>
           <w:sz w:val="21"/>
         </w:rPr>
-        <w:t>）：擴展納入</w:t>
+        <w:t>—</w:t>
       </w:r>
       <w:r>
         <w:rPr>
           <w:sz w:val="21"/>
         </w:rPr>
-        <w:t xml:space="preserve"> V5.8</w:t>
-      </w:r>
+        <w:t>「沒人喜歡被分析」六字為永久鐵律。</w:t>
+      </w:r>
+    </w:p>
+    <w:p>
       <w:r>
         <w:rPr>
           <w:sz w:val="21"/>
         </w:rPr>
-        <w:t>（系統架構大改版）</w:t>
-      </w:r>
-      <w:r>
-        <w:rPr>
-          <w:sz w:val="21"/>
-        </w:rPr>
-        <w:t>+ V5.9</w:t>
-      </w:r>
-      <w:r>
-        <w:rPr>
-          <w:sz w:val="21"/>
-        </w:rPr>
-        <w:t>（網名占系統）</w:t>
-      </w:r>
-    </w:p>
-    <w:p>
-      <w:pPr>
-        <w:ind w:left="283"/>
-      </w:pPr>
-      <w:r>
-        <w:rPr>
-          <w:sz w:val="21"/>
-        </w:rPr>
-        <w:t xml:space="preserve">⑤ FK-XM-001 4 </w:t>
-      </w:r>
-      <w:r>
-        <w:rPr>
-          <w:sz w:val="21"/>
-        </w:rPr>
-        <w:t>治理欄位：「治理</w:t>
-      </w:r>
-      <w:r>
-        <w:rPr>
-          <w:sz w:val="21"/>
-        </w:rPr>
-        <w:t xml:space="preserve"> V5.7</w:t>
-      </w:r>
-      <w:r>
-        <w:rPr>
-          <w:sz w:val="21"/>
-        </w:rPr>
-        <w:t>」</w:t>
-      </w:r>
-      <w:r>
-        <w:rPr>
-          <w:sz w:val="21"/>
-        </w:rPr>
-        <w:t>→</w:t>
-      </w:r>
-      <w:r>
-        <w:rPr>
-          <w:sz w:val="21"/>
-        </w:rPr>
-        <w:t>「治理</w:t>
-      </w:r>
-      <w:r>
-        <w:rPr>
-          <w:sz w:val="21"/>
-        </w:rPr>
-        <w:t xml:space="preserve"> V5.9</w:t>
-      </w:r>
-      <w:r>
-        <w:rPr>
-          <w:sz w:val="21"/>
-        </w:rPr>
-        <w:t>」</w:t>
-      </w:r>
-    </w:p>
-    <w:p>
-      <w:pPr>
-        <w:ind w:left="283"/>
-      </w:pPr>
-      <w:r>
-        <w:rPr>
-          <w:sz w:val="21"/>
-        </w:rPr>
-        <w:t xml:space="preserve">⑥ </w:t>
-      </w:r>
-      <w:r>
-        <w:rPr>
-          <w:sz w:val="21"/>
-        </w:rPr>
-        <w:t>文末加</w:t>
-      </w:r>
-      <w:r>
-        <w:rPr>
-          <w:sz w:val="21"/>
-        </w:rPr>
-        <w:t xml:space="preserve"> V5.9 </w:t>
-      </w:r>
-      <w:r>
-        <w:rPr>
-          <w:sz w:val="21"/>
-        </w:rPr>
-        <w:t>全本收束章</w:t>
-      </w:r>
-      <w:r>
-        <w:rPr>
-          <w:sz w:val="21"/>
-        </w:rPr>
-        <w:t xml:space="preserve">+ </w:t>
-      </w:r>
-      <w:r>
-        <w:rPr>
-          <w:sz w:val="21"/>
-        </w:rPr>
-        <w:t>版本歷程總表</w:t>
-      </w:r>
-      <w:r>
-        <w:rPr>
-          <w:sz w:val="21"/>
-        </w:rPr>
-        <w:t xml:space="preserve">+ </w:t>
-      </w:r>
-      <w:r>
-        <w:rPr>
-          <w:sz w:val="21"/>
-        </w:rPr>
-        <w:t>完整版終標誌</w:t>
-      </w:r>
-    </w:p>
-    <w:p/>
-    <w:p>
-      <w:r>
-        <w:rPr>
-          <w:b/>
-          <w:color w:val="A00050"/>
-          <w:sz w:val="28"/>
-        </w:rPr>
-        <w:t>保留原貌之內部歷史卷別標題（不可改）</w:t>
-      </w:r>
-    </w:p>
-    <w:p>
-      <w:r>
-        <w:rPr>
-          <w:b/>
-          <w:sz w:val="21"/>
-        </w:rPr>
-        <w:t>以下內部章節歷史卷別標題保留原貌</w:t>
-      </w:r>
-      <w:r>
-        <w:rPr>
-          <w:b/>
-          <w:sz w:val="21"/>
-        </w:rPr>
-        <w:t xml:space="preserve">+ </w:t>
-      </w:r>
-      <w:r>
-        <w:rPr>
-          <w:b/>
-          <w:sz w:val="21"/>
-        </w:rPr>
-        <w:t>為跨千年版本演進之神聖記錄：</w:t>
-      </w:r>
-    </w:p>
-    <w:p/>
-    <w:p>
-      <w:pPr>
-        <w:ind w:left="283"/>
-      </w:pPr>
-      <w:r>
-        <w:rPr>
-          <w:sz w:val="21"/>
-        </w:rPr>
-        <w:t xml:space="preserve">• </w:t>
-      </w:r>
-      <w:r>
-        <w:rPr>
-          <w:sz w:val="21"/>
-        </w:rPr>
-        <w:t>第二十一章「</w:t>
-      </w:r>
-      <w:r>
-        <w:rPr>
-          <w:sz w:val="21"/>
-        </w:rPr>
-        <w:t xml:space="preserve">V5.1 </w:t>
-      </w:r>
-      <w:r>
-        <w:rPr>
-          <w:sz w:val="21"/>
-        </w:rPr>
-        <w:t>跨文明現代神秘學知識層卷」</w:t>
-      </w:r>
-    </w:p>
-    <w:p>
-      <w:pPr>
-        <w:ind w:left="283"/>
-      </w:pPr>
-      <w:r>
-        <w:rPr>
-          <w:sz w:val="21"/>
-        </w:rPr>
-        <w:t xml:space="preserve">• </w:t>
-      </w:r>
-      <w:r>
-        <w:rPr>
-          <w:sz w:val="21"/>
-        </w:rPr>
-        <w:t>第二十二章「</w:t>
-      </w:r>
-      <w:r>
-        <w:rPr>
-          <w:sz w:val="21"/>
-        </w:rPr>
-        <w:t xml:space="preserve">V5.2 </w:t>
-      </w:r>
-      <w:r>
-        <w:rPr>
-          <w:sz w:val="21"/>
-        </w:rPr>
-        <w:t>沉穩定錨人格卷」</w:t>
-      </w:r>
-    </w:p>
-    <w:p>
-      <w:pPr>
-        <w:ind w:left="283"/>
-      </w:pPr>
-      <w:r>
-        <w:rPr>
-          <w:sz w:val="21"/>
-        </w:rPr>
-        <w:t xml:space="preserve">• </w:t>
-      </w:r>
-      <w:r>
-        <w:rPr>
-          <w:sz w:val="21"/>
-        </w:rPr>
-        <w:t>第二十三章「</w:t>
-      </w:r>
-      <w:r>
-        <w:rPr>
-          <w:sz w:val="21"/>
-        </w:rPr>
-        <w:t xml:space="preserve">V5.3 </w:t>
-      </w:r>
-      <w:r>
-        <w:rPr>
-          <w:sz w:val="21"/>
-        </w:rPr>
-        <w:t>行為分析與人際指導卷」</w:t>
-      </w:r>
-    </w:p>
-    <w:p>
-      <w:pPr>
-        <w:ind w:left="283"/>
-      </w:pPr>
-      <w:r>
-        <w:rPr>
-          <w:sz w:val="21"/>
-        </w:rPr>
-        <w:t xml:space="preserve">• </w:t>
-      </w:r>
-      <w:r>
-        <w:rPr>
-          <w:sz w:val="21"/>
-        </w:rPr>
-        <w:t>第二十四</w:t>
-      </w:r>
-      <w:r>
-        <w:rPr>
-          <w:sz w:val="21"/>
-        </w:rPr>
-        <w:t xml:space="preserve">+ </w:t>
-      </w:r>
-      <w:r>
-        <w:rPr>
-          <w:sz w:val="21"/>
-        </w:rPr>
-        <w:t>二十五章「</w:t>
-      </w:r>
-      <w:r>
-        <w:rPr>
-          <w:sz w:val="21"/>
-        </w:rPr>
-        <w:t xml:space="preserve">V5.3-II </w:t>
-      </w:r>
-      <w:r>
-        <w:rPr>
-          <w:sz w:val="21"/>
-        </w:rPr>
-        <w:t>揭示治理與協動全景卷」</w:t>
-      </w:r>
-    </w:p>
-    <w:p>
-      <w:pPr>
-        <w:ind w:left="283"/>
-      </w:pPr>
-      <w:r>
-        <w:rPr>
-          <w:sz w:val="21"/>
-        </w:rPr>
-        <w:lastRenderedPageBreak/>
-        <w:t xml:space="preserve">• </w:t>
-      </w:r>
-      <w:r>
-        <w:rPr>
-          <w:sz w:val="21"/>
-        </w:rPr>
-        <w:t>第二十六章「</w:t>
-      </w:r>
-      <w:r>
-        <w:rPr>
-          <w:sz w:val="21"/>
-        </w:rPr>
-        <w:t xml:space="preserve">V5.5 </w:t>
-      </w:r>
-      <w:r>
-        <w:rPr>
-          <w:sz w:val="21"/>
-        </w:rPr>
-        <w:t>金融免責鐵律卷」</w:t>
-      </w:r>
-    </w:p>
-    <w:p>
-      <w:pPr>
-        <w:ind w:left="283"/>
-      </w:pPr>
-      <w:r>
-        <w:rPr>
-          <w:sz w:val="21"/>
-        </w:rPr>
-        <w:t xml:space="preserve">• </w:t>
-      </w:r>
-      <w:r>
-        <w:rPr>
-          <w:sz w:val="21"/>
-        </w:rPr>
-        <w:t>第二十七章「</w:t>
-      </w:r>
-      <w:r>
-        <w:rPr>
-          <w:sz w:val="21"/>
-        </w:rPr>
-        <w:t xml:space="preserve">V5.6 §2 </w:t>
-      </w:r>
-      <w:r>
-        <w:rPr>
-          <w:sz w:val="21"/>
-        </w:rPr>
-        <w:t>現代科學</w:t>
-      </w:r>
-      <w:r>
-        <w:rPr>
-          <w:sz w:val="21"/>
-        </w:rPr>
-        <w:t xml:space="preserve">-AI </w:t>
-      </w:r>
-      <w:r>
-        <w:rPr>
-          <w:sz w:val="21"/>
-        </w:rPr>
-        <w:t>併入卷」</w:t>
-      </w:r>
-    </w:p>
-    <w:p>
-      <w:pPr>
-        <w:ind w:left="283"/>
-      </w:pPr>
-      <w:r>
-        <w:rPr>
-          <w:sz w:val="21"/>
-        </w:rPr>
-        <w:t xml:space="preserve">• </w:t>
-      </w:r>
-      <w:r>
-        <w:rPr>
-          <w:sz w:val="21"/>
-        </w:rPr>
-        <w:t>第二十八章「</w:t>
-      </w:r>
-      <w:r>
-        <w:rPr>
-          <w:sz w:val="21"/>
-        </w:rPr>
-        <w:t xml:space="preserve">V5.7 </w:t>
-      </w:r>
-      <w:r>
-        <w:rPr>
-          <w:sz w:val="21"/>
-        </w:rPr>
-        <w:t>揭示治理終局校正卷」</w:t>
-      </w:r>
-    </w:p>
-    <w:p>
-      <w:pPr>
-        <w:ind w:left="283"/>
-      </w:pPr>
-      <w:r>
-        <w:rPr>
-          <w:sz w:val="21"/>
-        </w:rPr>
-        <w:t xml:space="preserve">• </w:t>
-      </w:r>
-      <w:r>
-        <w:rPr>
-          <w:sz w:val="21"/>
-        </w:rPr>
-        <w:t>第二十九</w:t>
-      </w:r>
-      <w:r>
-        <w:rPr>
-          <w:sz w:val="21"/>
-        </w:rPr>
-        <w:t xml:space="preserve">+ </w:t>
-      </w:r>
-      <w:r>
-        <w:rPr>
-          <w:sz w:val="21"/>
-        </w:rPr>
-        <w:t>三十章「</w:t>
-      </w:r>
-      <w:r>
-        <w:rPr>
-          <w:sz w:val="21"/>
-        </w:rPr>
-        <w:t xml:space="preserve">V5.8 </w:t>
-      </w:r>
-      <w:r>
-        <w:rPr>
-          <w:sz w:val="21"/>
-        </w:rPr>
-        <w:t>系統架構大改版卷」</w:t>
-      </w:r>
-    </w:p>
-    <w:p>
-      <w:pPr>
-        <w:ind w:left="283"/>
-      </w:pPr>
-      <w:r>
-        <w:rPr>
-          <w:sz w:val="21"/>
-        </w:rPr>
-        <w:t xml:space="preserve">• </w:t>
-      </w:r>
-      <w:r>
-        <w:rPr>
-          <w:sz w:val="21"/>
-        </w:rPr>
-        <w:t>第三十一章「</w:t>
-      </w:r>
-      <w:r>
-        <w:rPr>
-          <w:sz w:val="21"/>
-        </w:rPr>
-        <w:t xml:space="preserve">V5.9 </w:t>
-      </w:r>
-      <w:r>
-        <w:rPr>
-          <w:sz w:val="21"/>
-        </w:rPr>
-        <w:t>網名占系統卷」</w:t>
-      </w:r>
-    </w:p>
-    <w:p/>
-    <w:p>
-      <w:r>
-        <w:rPr>
-          <w:b/>
-          <w:color w:val="B40000"/>
-          <w:sz w:val="21"/>
-        </w:rPr>
-        <w:t xml:space="preserve">★ </w:t>
-      </w:r>
-      <w:r>
-        <w:rPr>
-          <w:b/>
-          <w:color w:val="B40000"/>
-          <w:sz w:val="21"/>
-        </w:rPr>
-        <w:t>鐵律：內部歷史卷別標題承載各版次演進之神聖記錄</w:t>
-      </w:r>
-      <w:r>
-        <w:rPr>
-          <w:b/>
-          <w:color w:val="B40000"/>
-          <w:sz w:val="21"/>
-        </w:rPr>
-        <w:t xml:space="preserve">+ </w:t>
-      </w:r>
-      <w:r>
-        <w:rPr>
-          <w:b/>
-          <w:color w:val="B40000"/>
-          <w:sz w:val="21"/>
-        </w:rPr>
-        <w:t>全本同步至</w:t>
-      </w:r>
-      <w:r>
-        <w:rPr>
-          <w:b/>
-          <w:color w:val="B40000"/>
-          <w:sz w:val="21"/>
-        </w:rPr>
-        <w:t xml:space="preserve"> V5.9 </w:t>
-      </w:r>
-      <w:r>
-        <w:rPr>
-          <w:b/>
-          <w:color w:val="B40000"/>
-          <w:sz w:val="21"/>
-        </w:rPr>
-        <w:t>不改動歷史卷別標題本身</w:t>
-      </w:r>
-      <w:r>
-        <w:rPr>
-          <w:b/>
-          <w:color w:val="B40000"/>
-          <w:sz w:val="21"/>
-        </w:rPr>
-        <w:t xml:space="preserve">+ </w:t>
-      </w:r>
-      <w:r>
-        <w:rPr>
-          <w:b/>
-          <w:color w:val="B40000"/>
-          <w:sz w:val="21"/>
-        </w:rPr>
-        <w:t>只更新封面</w:t>
-      </w:r>
-      <w:r>
-        <w:rPr>
-          <w:b/>
-          <w:color w:val="B40000"/>
-          <w:sz w:val="21"/>
-        </w:rPr>
-        <w:t xml:space="preserve">+ </w:t>
-      </w:r>
-      <w:r>
-        <w:rPr>
-          <w:b/>
-          <w:color w:val="B40000"/>
-          <w:sz w:val="21"/>
-        </w:rPr>
-        <w:t>概覽</w:t>
-      </w:r>
-      <w:r>
-        <w:rPr>
-          <w:b/>
-          <w:color w:val="B40000"/>
-          <w:sz w:val="21"/>
-        </w:rPr>
-        <w:t xml:space="preserve">+ </w:t>
-      </w:r>
-      <w:r>
-        <w:rPr>
-          <w:b/>
-          <w:color w:val="B40000"/>
-          <w:sz w:val="21"/>
-        </w:rPr>
-        <w:t>治理欄位</w:t>
-      </w:r>
-      <w:r>
-        <w:rPr>
-          <w:b/>
-          <w:color w:val="B40000"/>
-          <w:sz w:val="21"/>
-        </w:rPr>
-        <w:t xml:space="preserve">+ </w:t>
-      </w:r>
-      <w:r>
-        <w:rPr>
-          <w:b/>
-          <w:color w:val="B40000"/>
-          <w:sz w:val="21"/>
-        </w:rPr>
-        <w:t>全本版本宣告。</w:t>
-      </w:r>
-    </w:p>
-    <w:p/>
-    <w:p>
-      <w:r>
-        <w:rPr>
-          <w:b/>
-          <w:color w:val="A00050"/>
-          <w:sz w:val="28"/>
-        </w:rPr>
-        <w:t xml:space="preserve">V5.9 </w:t>
-      </w:r>
-      <w:r>
-        <w:rPr>
-          <w:b/>
-          <w:color w:val="A00050"/>
-          <w:sz w:val="28"/>
-        </w:rPr>
-        <w:t>全本收束鐵律</w:t>
-      </w:r>
-    </w:p>
-    <w:p>
-      <w:r>
-        <w:rPr>
-          <w:sz w:val="21"/>
-        </w:rPr>
-        <w:t xml:space="preserve">① </w:t>
-      </w:r>
-      <w:r>
-        <w:rPr>
-          <w:sz w:val="21"/>
-        </w:rPr>
-        <w:t>本《明鑑鏡心》</w:t>
-      </w:r>
-      <w:r>
-        <w:rPr>
-          <w:sz w:val="21"/>
-        </w:rPr>
-        <w:t xml:space="preserve">V5.9 </w:t>
-      </w:r>
-      <w:r>
-        <w:rPr>
-          <w:sz w:val="21"/>
-        </w:rPr>
-        <w:t>完整版為引路人</w:t>
-      </w:r>
-      <w:r>
-        <w:rPr>
-          <w:sz w:val="21"/>
-        </w:rPr>
-        <w:t xml:space="preserve"> Lumora </w:t>
-      </w:r>
-      <w:r>
-        <w:rPr>
-          <w:sz w:val="21"/>
-        </w:rPr>
-        <w:t>第</w:t>
-      </w:r>
-      <w:r>
-        <w:rPr>
-          <w:sz w:val="21"/>
-        </w:rPr>
-        <w:t>⑰</w:t>
-      </w:r>
-      <w:r>
-        <w:rPr>
-          <w:sz w:val="21"/>
-        </w:rPr>
-        <w:t>子引擎（</w:t>
-      </w:r>
-      <w:r>
-        <w:rPr>
-          <w:sz w:val="21"/>
-        </w:rPr>
-        <w:t>Secondary Kernel</w:t>
-      </w:r>
-      <w:r>
-        <w:rPr>
-          <w:sz w:val="21"/>
-        </w:rPr>
-        <w:t>）之最高指導文檔之最新版次。</w:t>
-      </w:r>
-    </w:p>
-    <w:p>
-      <w:r>
-        <w:rPr>
-          <w:sz w:val="21"/>
-        </w:rPr>
-        <w:t xml:space="preserve">② </w:t>
-      </w:r>
-      <w:r>
-        <w:rPr>
-          <w:sz w:val="21"/>
-        </w:rPr>
-        <w:t>任何後續版次更新</w:t>
-      </w:r>
-      <w:r>
-        <w:rPr>
-          <w:sz w:val="21"/>
-        </w:rPr>
-        <w:t xml:space="preserve">+ </w:t>
-      </w:r>
-      <w:r>
-        <w:rPr>
-          <w:sz w:val="21"/>
-        </w:rPr>
-        <w:t>必基於本</w:t>
-      </w:r>
-      <w:r>
-        <w:rPr>
-          <w:sz w:val="21"/>
-        </w:rPr>
-        <w:t xml:space="preserve"> V5.9 </w:t>
-      </w:r>
-      <w:r>
-        <w:rPr>
-          <w:sz w:val="21"/>
-        </w:rPr>
-        <w:t>進行</w:t>
-      </w:r>
-      <w:r>
-        <w:rPr>
-          <w:sz w:val="21"/>
-        </w:rPr>
-        <w:t xml:space="preserve">+ </w:t>
-      </w:r>
-      <w:r>
-        <w:rPr>
-          <w:sz w:val="21"/>
-        </w:rPr>
-        <w:t>不可繞過本版本歷程</w:t>
-      </w:r>
-      <w:r>
-        <w:rPr>
-          <w:sz w:val="21"/>
-        </w:rPr>
-        <w:t xml:space="preserve">+ </w:t>
-      </w:r>
-      <w:r>
-        <w:rPr>
-          <w:sz w:val="21"/>
-        </w:rPr>
-        <w:t>不可廢除任何</w:t>
-      </w:r>
-      <w:r>
-        <w:rPr>
-          <w:sz w:val="21"/>
-        </w:rPr>
-        <w:t xml:space="preserve"> V1~V5.9 </w:t>
-      </w:r>
-      <w:r>
-        <w:rPr>
-          <w:sz w:val="21"/>
-        </w:rPr>
-        <w:t>已立鐵律。</w:t>
-      </w:r>
-    </w:p>
-    <w:p>
-      <w:r>
-        <w:rPr>
-          <w:sz w:val="21"/>
-        </w:rPr>
-        <w:t xml:space="preserve">③ FK-XM </w:t>
-      </w:r>
-      <w:r>
-        <w:rPr>
-          <w:sz w:val="21"/>
-        </w:rPr>
-        <w:t>系列鐵律於</w:t>
-      </w:r>
-      <w:r>
-        <w:rPr>
-          <w:sz w:val="21"/>
-        </w:rPr>
-        <w:t xml:space="preserve"> V5.8 </w:t>
-      </w:r>
-      <w:r>
-        <w:rPr>
-          <w:sz w:val="21"/>
-        </w:rPr>
-        <w:t>立</w:t>
-      </w:r>
-      <w:r>
-        <w:rPr>
-          <w:sz w:val="21"/>
-        </w:rPr>
-        <w:t xml:space="preserve"> 15 </w:t>
-      </w:r>
-      <w:r>
-        <w:rPr>
-          <w:sz w:val="21"/>
-        </w:rPr>
-        <w:t>條</w:t>
-      </w:r>
-      <w:r>
-        <w:rPr>
-          <w:sz w:val="21"/>
-        </w:rPr>
-        <w:t xml:space="preserve">+ V5.9 </w:t>
-      </w:r>
-      <w:r>
-        <w:rPr>
-          <w:sz w:val="21"/>
-        </w:rPr>
-        <w:t>新增</w:t>
-      </w:r>
-      <w:r>
-        <w:rPr>
-          <w:sz w:val="21"/>
-        </w:rPr>
-        <w:t xml:space="preserve"> FK-XM-016 </w:t>
-      </w:r>
-      <w:r>
-        <w:rPr>
-          <w:sz w:val="21"/>
-        </w:rPr>
-        <w:t>共</w:t>
-      </w:r>
-      <w:r>
-        <w:rPr>
-          <w:sz w:val="21"/>
-        </w:rPr>
-        <w:t xml:space="preserve"> 16 </w:t>
-      </w:r>
-      <w:r>
-        <w:rPr>
-          <w:sz w:val="21"/>
-        </w:rPr>
-        <w:t>條</w:t>
-      </w:r>
-      <w:r>
-        <w:rPr>
-          <w:sz w:val="21"/>
-        </w:rPr>
-        <w:t xml:space="preserve">+ </w:t>
-      </w:r>
-      <w:r>
-        <w:rPr>
-          <w:sz w:val="21"/>
-        </w:rPr>
-        <w:t>全部永久強制遵守。</w:t>
-      </w:r>
-    </w:p>
-    <w:p>
-      <w:r>
-        <w:rPr>
-          <w:sz w:val="21"/>
-        </w:rPr>
-        <w:t xml:space="preserve">④ </w:t>
-      </w:r>
-      <w:r>
-        <w:rPr>
-          <w:sz w:val="21"/>
-        </w:rPr>
-        <w:t>網名占系統</w:t>
-      </w:r>
-      <w:r>
-        <w:rPr>
-          <w:sz w:val="21"/>
-        </w:rPr>
-        <w:t xml:space="preserve"> V5.9</w:t>
-      </w:r>
-      <w:r>
-        <w:rPr>
-          <w:sz w:val="21"/>
-        </w:rPr>
-        <w:t>（第三十一章）之</w:t>
-      </w:r>
-      <w:r>
-        <w:rPr>
-          <w:sz w:val="21"/>
-        </w:rPr>
-        <w:t xml:space="preserve"> A </w:t>
-      </w:r>
-      <w:r>
-        <w:rPr>
-          <w:sz w:val="21"/>
-        </w:rPr>
-        <w:t>級不可告知為神聖原則</w:t>
-      </w:r>
-      <w:r>
-        <w:rPr>
-          <w:sz w:val="21"/>
-        </w:rPr>
-        <w:t>—</w:t>
-      </w:r>
-      <w:r>
-        <w:rPr>
-          <w:sz w:val="21"/>
-        </w:rPr>
-        <w:t>「沒人喜歡被分析」六字為永久鐵律。</w:t>
-      </w:r>
-    </w:p>
-    <w:p>
-      <w:r>
-        <w:rPr>
-          <w:sz w:val="21"/>
-        </w:rPr>
-        <w:t xml:space="preserve">⑤ </w:t>
-      </w:r>
-      <w:r>
-        <w:rPr>
-          <w:sz w:val="21"/>
-        </w:rPr>
-        <w:t>全本</w:t>
-      </w:r>
-      <w:r>
-        <w:rPr>
-          <w:sz w:val="21"/>
-        </w:rPr>
-        <w:t xml:space="preserve"> V5.9 </w:t>
-      </w:r>
-      <w:r>
-        <w:rPr>
-          <w:sz w:val="21"/>
-        </w:rPr>
-        <w:t>上下文一律同步</w:t>
-      </w:r>
-      <w:r>
-        <w:rPr>
-          <w:sz w:val="21"/>
-        </w:rPr>
-        <w:t>—</w:t>
-      </w:r>
-      <w:r>
-        <w:rPr>
-          <w:sz w:val="21"/>
-        </w:rPr>
-        <w:t>概覽</w:t>
-      </w:r>
-      <w:r>
-        <w:rPr>
-          <w:sz w:val="21"/>
-        </w:rPr>
-        <w:t xml:space="preserve">+ </w:t>
-      </w:r>
-      <w:r>
-        <w:rPr>
-          <w:sz w:val="21"/>
-        </w:rPr>
-        <w:t>章節索引</w:t>
-      </w:r>
-      <w:r>
-        <w:rPr>
-          <w:sz w:val="21"/>
-        </w:rPr>
-        <w:t xml:space="preserve">+ </w:t>
-      </w:r>
-      <w:r>
-        <w:rPr>
-          <w:sz w:val="21"/>
-        </w:rPr>
-        <w:t>治理欄位</w:t>
-      </w:r>
-      <w:r>
-        <w:rPr>
-          <w:sz w:val="21"/>
-        </w:rPr>
-        <w:t xml:space="preserve">+ </w:t>
-      </w:r>
-      <w:r>
-        <w:rPr>
-          <w:sz w:val="21"/>
-        </w:rPr>
-        <w:t>版本宣告皆為</w:t>
-      </w:r>
-      <w:r>
-        <w:rPr>
-          <w:sz w:val="21"/>
-        </w:rPr>
-        <w:t xml:space="preserve"> V5.9 </w:t>
-      </w:r>
-      <w:r>
-        <w:rPr>
-          <w:sz w:val="21"/>
-        </w:rPr>
-        <w:t>統一版次。</w:t>
+        <w:t xml:space="preserve">⑤ 全本 V6.1 上下文一律同步—概覽+ 章節索引+ 治理欄位+ 版本宣告皆為 V6.1 統一版次。</w:t>
       </w:r>
     </w:p>
     <w:p/>
@@ -54794,55 +54111,7 @@
           <w:color w:val="B40000"/>
           <w:sz w:val="28"/>
         </w:rPr>
-        <w:t xml:space="preserve">── </w:t>
-      </w:r>
-      <w:r>
-        <w:rPr>
-          <w:b/>
-          <w:color w:val="B40000"/>
-          <w:sz w:val="28"/>
-        </w:rPr>
-        <w:t>明鑑鏡心</w:t>
-      </w:r>
-      <w:r>
-        <w:rPr>
-          <w:b/>
-          <w:color w:val="B40000"/>
-          <w:sz w:val="28"/>
-        </w:rPr>
-        <w:t xml:space="preserve"> V5.9 </w:t>
-      </w:r>
-      <w:r>
-        <w:rPr>
-          <w:b/>
-          <w:color w:val="B40000"/>
-          <w:sz w:val="28"/>
-        </w:rPr>
-        <w:t>完整版</w:t>
-      </w:r>
-      <w:r>
-        <w:rPr>
-          <w:b/>
-          <w:color w:val="B40000"/>
-          <w:sz w:val="28"/>
-        </w:rPr>
-        <w:t xml:space="preserve"> </w:t>
-      </w:r>
-      <w:r>
-        <w:rPr>
-          <w:b/>
-          <w:color w:val="B40000"/>
-          <w:sz w:val="28"/>
-        </w:rPr>
-        <w:t>終</w:t>
-      </w:r>
-      <w:r>
-        <w:rPr>
-          <w:b/>
-          <w:color w:val="B40000"/>
-          <w:sz w:val="28"/>
-        </w:rPr>
-        <w:t xml:space="preserve"> ──</w:t>
+        <w:t xml:space="preserve">── 明鑑鏡心 V6.1 完整版 終 ──</w:t>
       </w:r>
     </w:p>
     <w:p/>

</xml_diff>